<commit_message>
docs(estacion): los conteos anuales dicen por que difieren
La tabla de totales anuales invitaba justamente la pregunta que produjo: por que
35.040 en unos anos y 35.136 en otros. No es variacion, es el calendario. A 15
minutos hay 96 registros por dia, asi que un ano normal da 365 x 96 = 35.040 y uno
bisiesto 366 x 96 = 35.136; los 96 de diferencia en 2020 y 2024 son exactamente el
29 de febrero.

Verificado sobre el archivo, ano por ano: cada ano completo da su maximo aritmetico
exacto, sin un solo registro de menos, salvo 2025 con 35.036 por los cuatro
registros del 2025-09-07 que ya declara 1.5.

Que 2023 de 35.040 exactos es de paso una confirmacion mas de que el salto de reloj
de ese ano no perdio datos: solo movio estampas.

.docx reexportado con la nota, misma fecha de exportacion.

Co-Authored-By: Claude Opus 5 <noreply@anthropic.com>
</commit_message>
<xml_diff>
--- a/Estacion meteorologica/GeoMountains/FICHA-TECNICA-WS01.docx
+++ b/Estacion meteorologica/GeoMountains/FICHA-TECNICA-WS01.docx
@@ -1137,6 +1137,89 @@
         </w:tc>
       </w:tr>
     </w:tbl>
+    <w:p>
+      <w:pPr>
+        <w:pStyle w:val="BodyText"/>
+      </w:pPr>
+      <w:r>
+        <w:rPr>
+          <w:b/>
+          <w:bCs/>
+        </w:rPr>
+        <w:t xml:space="preserve">Los conteos anuales son el máximo aritmético, no una aproximación.</w:t>
+      </w:r>
+      <w:r>
+        <w:t xml:space="preserve"> </w:t>
+      </w:r>
+      <w:r>
+        <w:t xml:space="preserve">A 15 minutos</w:t>
+      </w:r>
+      <w:r>
+        <w:t xml:space="preserve"> </w:t>
+      </w:r>
+      <w:r>
+        <w:t xml:space="preserve">hay 96 registros por día, de modo que un año normal da 365 × 96 =</w:t>
+      </w:r>
+      <w:r>
+        <w:t xml:space="preserve"> </w:t>
+      </w:r>
+      <w:r>
+        <w:rPr>
+          <w:b/>
+          <w:bCs/>
+        </w:rPr>
+        <w:t xml:space="preserve">35.040</w:t>
+      </w:r>
+      <w:r>
+        <w:t xml:space="preserve"> </w:t>
+      </w:r>
+      <w:r>
+        <w:t xml:space="preserve">y uno</w:t>
+      </w:r>
+      <w:r>
+        <w:t xml:space="preserve"> </w:t>
+      </w:r>
+      <w:r>
+        <w:t xml:space="preserve">bisiesto 366 × 96 =</w:t>
+      </w:r>
+      <w:r>
+        <w:t xml:space="preserve"> </w:t>
+      </w:r>
+      <w:r>
+        <w:rPr>
+          <w:b/>
+          <w:bCs/>
+        </w:rPr>
+        <w:t xml:space="preserve">35.136</w:t>
+      </w:r>
+      <w:r>
+        <w:t xml:space="preserve">; los 96 registros de diferencia en 2020 y 2024 son</w:t>
+      </w:r>
+      <w:r>
+        <w:t xml:space="preserve"> </w:t>
+      </w:r>
+      <w:r>
+        <w:t xml:space="preserve">exactamente el 29 de febrero. Cada año completo da su máximo exacto, sin un solo</w:t>
+      </w:r>
+      <w:r>
+        <w:t xml:space="preserve"> </w:t>
+      </w:r>
+      <w:r>
+        <w:t xml:space="preserve">registro de menos, salvo 2025, que queda en 35.036 por los cuatro registros del</w:t>
+      </w:r>
+      <w:r>
+        <w:t xml:space="preserve"> </w:t>
+      </w:r>
+      <w:r>
+        <w:t xml:space="preserve">2025-09-07 descritos en §1.5. Que 2023 dé 35.040 exactos confirma además que el</w:t>
+      </w:r>
+      <w:r>
+        <w:t xml:space="preserve"> </w:t>
+      </w:r>
+      <w:r>
+        <w:t xml:space="preserve">salto de reloj de ese año no perdió datos: sólo movió estampas.</w:t>
+      </w:r>
+    </w:p>
     <w:bookmarkEnd w:id="9"/>
     <w:bookmarkStart w:id="10" w:name="referencia-temporal"/>
     <w:p>

</xml_diff>